<commit_message>
Add author info: Nguyen Dang Dien (20225805), instructor Do Cong Thuan
Co-Authored-By: Claude Fable 5 <noreply@anthropic.com>
</commit_message>
<xml_diff>
--- a/BaoCao_FlappyBird.docx
+++ b/BaoCao_FlappyBird.docx
@@ -39,7 +39,7 @@
           <w:sz w:val="26"/>
           <w:szCs w:val="26"/>
         </w:rPr>
-        <w:t>Nhóm th</w:t>
+        <w:t>Sinh viên th</w:t>
       </w:r>
       <w:r>
         <w:rPr>
@@ -82,31 +82,154 @@
           <w:sz w:val="26"/>
           <w:szCs w:val="26"/>
         </w:rPr>
-        <w:t xml:space="preserve"> </w:t>
-      </w:r>
-      <w:r>
-        <w:rPr>
-          <w:rStyle w:val="placeholder1"/>
-          <w:sz w:val="26"/>
-          <w:szCs w:val="26"/>
-        </w:rPr>
-        <w:t>(đi</w:t>
-      </w:r>
-      <w:r>
-        <w:rPr>
-          <w:rStyle w:val="placeholder1"/>
-          <w:sz w:val="26"/>
-          <w:szCs w:val="26"/>
-        </w:rPr>
-        <w:t>ề</w:t>
-      </w:r>
-      <w:r>
-        <w:rPr>
-          <w:rStyle w:val="placeholder1"/>
-          <w:sz w:val="26"/>
-          <w:szCs w:val="26"/>
-        </w:rPr>
-        <w:t>n tên các thành viên)</w:t>
+        <w:t xml:space="preserve"> Nguy</w:t>
+      </w:r>
+      <w:r>
+        <w:rPr>
+          <w:sz w:val="26"/>
+          <w:szCs w:val="26"/>
+        </w:rPr>
+        <w:t>ễ</w:t>
+      </w:r>
+      <w:r>
+        <w:rPr>
+          <w:sz w:val="26"/>
+          <w:szCs w:val="26"/>
+        </w:rPr>
+        <w:t>n Đăng Di</w:t>
+      </w:r>
+      <w:r>
+        <w:rPr>
+          <w:sz w:val="26"/>
+          <w:szCs w:val="26"/>
+        </w:rPr>
+        <w:t>ệ</w:t>
+      </w:r>
+      <w:r>
+        <w:rPr>
+          <w:sz w:val="26"/>
+          <w:szCs w:val="26"/>
+        </w:rPr>
+        <w:t>n — MSSV 20225805</w:t>
+      </w:r>
+      <w:r>
+        <w:rPr>
+          <w:sz w:val="26"/>
+          <w:szCs w:val="26"/>
+        </w:rPr>
+        <w:br/>
+      </w:r>
+      <w:r>
+        <w:rPr>
+          <w:b/>
+          <w:bCs/>
+          <w:sz w:val="26"/>
+          <w:szCs w:val="26"/>
+        </w:rPr>
+        <w:t>Gi</w:t>
+      </w:r>
+      <w:r>
+        <w:rPr>
+          <w:b/>
+          <w:bCs/>
+          <w:sz w:val="26"/>
+          <w:szCs w:val="26"/>
+        </w:rPr>
+        <w:t>ả</w:t>
+      </w:r>
+      <w:r>
+        <w:rPr>
+          <w:b/>
+          <w:bCs/>
+          <w:sz w:val="26"/>
+          <w:szCs w:val="26"/>
+        </w:rPr>
+        <w:t>ng viên hư</w:t>
+      </w:r>
+      <w:r>
+        <w:rPr>
+          <w:b/>
+          <w:bCs/>
+          <w:sz w:val="26"/>
+          <w:szCs w:val="26"/>
+        </w:rPr>
+        <w:t>ớ</w:t>
+      </w:r>
+      <w:r>
+        <w:rPr>
+          <w:b/>
+          <w:bCs/>
+          <w:sz w:val="26"/>
+          <w:szCs w:val="26"/>
+        </w:rPr>
+        <w:t>ng d</w:t>
+      </w:r>
+      <w:r>
+        <w:rPr>
+          <w:b/>
+          <w:bCs/>
+          <w:sz w:val="26"/>
+          <w:szCs w:val="26"/>
+        </w:rPr>
+        <w:t>ẫ</w:t>
+      </w:r>
+      <w:r>
+        <w:rPr>
+          <w:b/>
+          <w:bCs/>
+          <w:sz w:val="26"/>
+          <w:szCs w:val="26"/>
+        </w:rPr>
+        <w:t>n:</w:t>
+      </w:r>
+      <w:r>
+        <w:rPr>
+          <w:sz w:val="26"/>
+          <w:szCs w:val="26"/>
+        </w:rPr>
+        <w:t xml:space="preserve"> Th</w:t>
+      </w:r>
+      <w:r>
+        <w:rPr>
+          <w:sz w:val="26"/>
+          <w:szCs w:val="26"/>
+        </w:rPr>
+        <w:t>ầ</w:t>
+      </w:r>
+      <w:r>
+        <w:rPr>
+          <w:sz w:val="26"/>
+          <w:szCs w:val="26"/>
+        </w:rPr>
+        <w:t>y Đ</w:t>
+      </w:r>
+      <w:r>
+        <w:rPr>
+          <w:sz w:val="26"/>
+          <w:szCs w:val="26"/>
+        </w:rPr>
+        <w:t>ỗ</w:t>
+      </w:r>
+      <w:r>
+        <w:rPr>
+          <w:sz w:val="26"/>
+          <w:szCs w:val="26"/>
+        </w:rPr>
+        <w:t xml:space="preserve"> Công Thu</w:t>
+      </w:r>
+      <w:r>
+        <w:rPr>
+          <w:sz w:val="26"/>
+          <w:szCs w:val="26"/>
+        </w:rPr>
+        <w:t>ầ</w:t>
+      </w:r>
+      <w:r>
+        <w:rPr>
+          <w:sz w:val="26"/>
+          <w:szCs w:val="26"/>
+        </w:rPr>
+        <w:t>n</w:t>
       </w:r>
       <w:r>
         <w:rPr>
@@ -1167,6 +1290,7 @@
               <w:rPr>
                 <w:rFonts w:eastAsia="Times New Roman"/>
               </w:rPr>
+              <w:lastRenderedPageBreak/>
               <w:t>F3</w:t>
             </w:r>
           </w:p>
@@ -1265,7 +1389,6 @@
               <w:rPr>
                 <w:rFonts w:eastAsia="Times New Roman"/>
               </w:rPr>
-              <w:lastRenderedPageBreak/>
               <w:t>F4</w:t>
             </w:r>
           </w:p>
@@ -2281,6 +2404,7 @@
               <w:rPr>
                 <w:rFonts w:eastAsia="Times New Roman"/>
               </w:rPr>
+              <w:lastRenderedPageBreak/>
               <w:t>N2</w:t>
             </w:r>
           </w:p>
@@ -2379,7 +2503,6 @@
               <w:rPr>
                 <w:rFonts w:eastAsia="Times New Roman"/>
               </w:rPr>
-              <w:lastRenderedPageBreak/>
               <w:t>N3</w:t>
             </w:r>
           </w:p>
@@ -5823,16 +5946,7 @@
         <w:pStyle w:val="HTMLPreformatted"/>
       </w:pPr>
       <w:r>
-        <w:t xml:space="preserve">                    </w:t>
-      </w:r>
-      <w:r>
-        <w:t>│</w:t>
-      </w:r>
-      <w:r>
-        <w:t xml:space="preserve">        STM32F429ZIT6 (180MHz)     </w:t>
-      </w:r>
-      <w:r>
-        <w:t>│</w:t>
+        <w:t xml:space="preserve">                    │        STM32F429ZIT6 (180MHz)     │</w:t>
       </w:r>
     </w:p>
     <w:p>
@@ -5840,34 +5954,7 @@
         <w:pStyle w:val="HTMLPreformatted"/>
       </w:pPr>
       <w:r>
-        <w:t xml:space="preserve">   </w:t>
-      </w:r>
-      <w:r>
-        <w:t>┌─────────┐ SPI5 │</w:t>
-      </w:r>
-      <w:r>
-        <w:t xml:space="preserve">  </w:t>
-      </w:r>
-      <w:r>
-        <w:t>┌──────┐</w:t>
-      </w:r>
-      <w:r>
-        <w:t xml:space="preserve">   </w:t>
-      </w:r>
-      <w:r>
-        <w:t>┌───────┐</w:t>
-      </w:r>
-      <w:r>
-        <w:t xml:space="preserve">  </w:t>
-      </w:r>
-      <w:r>
-        <w:t>┌──────┐</w:t>
-      </w:r>
-      <w:r>
-        <w:t xml:space="preserve">  </w:t>
-      </w:r>
-      <w:r>
-        <w:t>│</w:t>
+        <w:t xml:space="preserve">   ┌─────────┐ SPI5 │  ┌──────┐   ┌───────┐  ┌──────┐  │</w:t>
       </w:r>
     </w:p>
     <w:p>
@@ -5875,34 +5962,7 @@
         <w:pStyle w:val="HTMLPreformatted"/>
       </w:pPr>
       <w:r>
-        <w:t xml:space="preserve">   </w:t>
-      </w:r>
-      <w:r>
-        <w:t>│ ILI9341 │◄─────┼──┤ SPI5 │</w:t>
-      </w:r>
-      <w:r>
-        <w:t xml:space="preserve">   </w:t>
-      </w:r>
-      <w:r>
-        <w:t>│ LTDC</w:t>
-      </w:r>
-      <w:r>
-        <w:t xml:space="preserve">  </w:t>
-      </w:r>
-      <w:r>
-        <w:t>│</w:t>
-      </w:r>
-      <w:r>
-        <w:t xml:space="preserve">  </w:t>
-      </w:r>
-      <w:r>
-        <w:t>│DMA2D │</w:t>
-      </w:r>
-      <w:r>
-        <w:t xml:space="preserve">  </w:t>
-      </w:r>
-      <w:r>
-        <w:t>│</w:t>
+        <w:t xml:space="preserve">   │ ILI9341 │◄─────┼──┤ SPI5 │   │ LTDC  │  │DMA2D │  │</w:t>
       </w:r>
     </w:p>
     <w:p>
@@ -5910,49 +5970,10 @@
         <w:pStyle w:val="HTMLPreformatted"/>
       </w:pPr>
       <w:r>
-        <w:t xml:space="preserve">   </w:t>
-      </w:r>
-      <w:r>
-        <w:t>│</w:t>
-      </w:r>
-      <w:r>
-        <w:t xml:space="preserve">  LCD    </w:t>
-      </w:r>
-      <w:r>
-        <w:t>│ RGB</w:t>
-      </w:r>
-      <w:r>
-        <w:t xml:space="preserve">  </w:t>
-      </w:r>
-      <w:r>
-        <w:t>│</w:t>
-      </w:r>
-      <w:r>
-        <w:t xml:space="preserve">  </w:t>
-      </w:r>
-      <w:r>
-        <w:t>└──────┘</w:t>
-      </w:r>
-      <w:r>
-        <w:t xml:space="preserve">   </w:t>
-      </w:r>
-      <w:r>
-        <w:t>└───┬───┘</w:t>
-      </w:r>
-      <w:r>
-        <w:t xml:space="preserve"> </w:t>
-      </w:r>
-      <w:r>
-        <w:t xml:space="preserve"> </w:t>
-      </w:r>
-      <w:r>
-        <w:t>└──┬───┘</w:t>
-      </w:r>
-      <w:r>
-        <w:t xml:space="preserve">  </w:t>
-      </w:r>
-      <w:r>
-        <w:t>│</w:t>
+        <w:t xml:space="preserve">   │  LCD    │ RGB  │  └──────┘   └───┬───┘ </w:t>
+      </w:r>
+      <w:r>
+        <w:t xml:space="preserve"> └──┬───┘  │</w:t>
       </w:r>
     </w:p>
     <w:p>
@@ -5960,28 +5981,7 @@
         <w:pStyle w:val="HTMLPreformatted"/>
       </w:pPr>
       <w:r>
-        <w:t xml:space="preserve">   </w:t>
-      </w:r>
-      <w:r>
-        <w:t>│ 320x240 │◄─────┼────────────────┘</w:t>
-      </w:r>
-      <w:r>
-        <w:t xml:space="preserve">          </w:t>
-      </w:r>
-      <w:r>
-        <w:t>│</w:t>
-      </w:r>
-      <w:r>
-        <w:t xml:space="preserve">      </w:t>
-      </w:r>
-      <w:r>
-        <w:t>│</w:t>
-      </w:r>
-      <w:r>
-        <w:t xml:space="preserve">  FMC(16bit,90MHz)  </w:t>
-      </w:r>
-      <w:r>
-        <w:t>┌──────────┐</w:t>
+        <w:t xml:space="preserve">   │ 320x240 │◄─────┼────────────────┘          │      │  FMC(16bit,90MHz)  ┌──────────┐</w:t>
       </w:r>
     </w:p>
     <w:p>
@@ -5989,22 +5989,7 @@
         <w:pStyle w:val="HTMLPreformatted"/>
       </w:pPr>
       <w:r>
-        <w:t xml:space="preserve">   </w:t>
-      </w:r>
-      <w:r>
-        <w:t>└─────────┘</w:t>
-      </w:r>
-      <w:r>
-        <w:t xml:space="preserve">      </w:t>
-      </w:r>
-      <w:r>
-        <w:t>│</w:t>
-      </w:r>
-      <w:r>
-        <w:t xml:space="preserve">            </w:t>
-      </w:r>
-      <w:r>
-        <w:t>AHB bus ───────┴──────┼───────────────────►│ SDRAM 8MB │</w:t>
+        <w:t xml:space="preserve">   └─────────┘      │            AHB bus ───────┴──────┼───────────────────►│ SDRAM 8MB │</w:t>
       </w:r>
     </w:p>
     <w:p>
@@ -6012,28 +5997,7 @@
         <w:pStyle w:val="HTMLPreformatted"/>
       </w:pPr>
       <w:r>
-        <w:t xml:space="preserve">   </w:t>
-      </w:r>
-      <w:r>
-        <w:t>┌─────────┐ I2C3 │</w:t>
-      </w:r>
-      <w:r>
-        <w:t xml:space="preserve">  </w:t>
-      </w:r>
-      <w:r>
-        <w:t>┌──────┐</w:t>
-      </w:r>
-      <w:r>
-        <w:t xml:space="preserve">                        </w:t>
-      </w:r>
-      <w:r>
-        <w:t>│</w:t>
-      </w:r>
-      <w:r>
-        <w:t xml:space="preserve">   0xD0000000       </w:t>
-      </w:r>
-      <w:r>
-        <w:t>│(framebuf) │</w:t>
+        <w:t xml:space="preserve">   ┌─────────┐ I2C3 │  ┌──────┐                        │   0xD0000000       │(framebuf) │</w:t>
       </w:r>
     </w:p>
     <w:p>
@@ -6041,34 +6005,7 @@
         <w:pStyle w:val="HTMLPreformatted"/>
       </w:pPr>
       <w:r>
-        <w:t xml:space="preserve">   </w:t>
-      </w:r>
-      <w:r>
-        <w:t>│STMPE811 │◄─────┼──┤ I2C3 │</w:t>
-      </w:r>
-      <w:r>
-        <w:t xml:space="preserve">  </w:t>
-      </w:r>
-      <w:r>
-        <w:t>┌──────┐</w:t>
-      </w:r>
-      <w:r>
-        <w:t xml:space="preserve">  </w:t>
-      </w:r>
-      <w:r>
-        <w:t>┌────────┐</w:t>
-      </w:r>
-      <w:r>
-        <w:t xml:space="preserve">  </w:t>
-      </w:r>
-      <w:r>
-        <w:t>│</w:t>
-      </w:r>
-      <w:r>
-        <w:t xml:space="preserve">                    </w:t>
-      </w:r>
-      <w:r>
-        <w:t>└──────────┘</w:t>
+        <w:t xml:space="preserve">   │STMPE811 │◄─────┼──┤ I2C3 │  ┌──────┐  ┌────────┐  │                    └──────────┘</w:t>
       </w:r>
     </w:p>
     <w:p>
@@ -6076,40 +6013,7 @@
         <w:pStyle w:val="HTMLPreformatted"/>
       </w:pPr>
       <w:r>
-        <w:t xml:space="preserve">   </w:t>
-      </w:r>
-      <w:r>
-        <w:t>│ (touch) │ 0x82 │</w:t>
-      </w:r>
-      <w:r>
-        <w:t xml:space="preserve">  </w:t>
-      </w:r>
-      <w:r>
-        <w:t>└──────┘</w:t>
-      </w:r>
-      <w:r>
-        <w:t xml:space="preserve">  </w:t>
-      </w:r>
-      <w:r>
-        <w:t>│ TIM7 │</w:t>
-      </w:r>
-      <w:r>
-        <w:t xml:space="preserve">  </w:t>
-      </w:r>
-      <w:r>
-        <w:t>│</w:t>
-      </w:r>
-      <w:r>
-        <w:t xml:space="preserve">  CRC   </w:t>
-      </w:r>
-      <w:r>
-        <w:t>│</w:t>
-      </w:r>
-      <w:r>
-        <w:t xml:space="preserve">  </w:t>
-      </w:r>
-      <w:r>
-        <w:t>│</w:t>
+        <w:t xml:space="preserve">   │ (touch) │ 0x82 │  └──────┘  │ TIM7 │  │  CRC   │  │</w:t>
       </w:r>
     </w:p>
     <w:p>
@@ -6117,34 +6021,7 @@
         <w:pStyle w:val="HTMLPreformatted"/>
       </w:pPr>
       <w:r>
-        <w:t xml:space="preserve">   </w:t>
-      </w:r>
-      <w:r>
-        <w:t>└─────────┘</w:t>
-      </w:r>
-      <w:r>
-        <w:t xml:space="preserve">      </w:t>
-      </w:r>
-      <w:r>
-        <w:t>│</w:t>
-      </w:r>
-      <w:r>
-        <w:t xml:space="preserve">            </w:t>
-      </w:r>
-      <w:r>
-        <w:t>└──────┘</w:t>
-      </w:r>
-      <w:r>
-        <w:t xml:space="preserve">  </w:t>
-      </w:r>
-      <w:r>
-        <w:t>└────────┘</w:t>
-      </w:r>
-      <w:r>
-        <w:t xml:space="preserve">  </w:t>
-      </w:r>
-      <w:r>
-        <w:t>│</w:t>
+        <w:t xml:space="preserve">   └─────────┘      │            └──────┘  └────────┘  │</w:t>
       </w:r>
     </w:p>
     <w:p>
@@ -8696,29 +8573,71 @@
         </w:rPr>
         <w:t xml:space="preserve"> </w:t>
       </w:r>
-      <w:r>
-        <w:rPr>
-          <w:rStyle w:val="placeholder1"/>
-          <w:sz w:val="26"/>
-          <w:szCs w:val="26"/>
-        </w:rPr>
-        <w:t>(đi</w:t>
-      </w:r>
-      <w:r>
-        <w:rPr>
-          <w:rStyle w:val="placeholder1"/>
-          <w:sz w:val="26"/>
-          <w:szCs w:val="26"/>
-        </w:rPr>
-        <w:t>ề</w:t>
-      </w:r>
-      <w:r>
-        <w:rPr>
-          <w:rStyle w:val="placeholder1"/>
-          <w:sz w:val="26"/>
-          <w:szCs w:val="26"/>
-        </w:rPr>
-        <w:t>n link GitHub sau khi push, kèm file README.md)</w:t>
+      <w:hyperlink r:id="rId5" w:history="1">
+        <w:r>
+          <w:rPr>
+            <w:rStyle w:val="Hyperlink"/>
+            <w:sz w:val="26"/>
+            <w:szCs w:val="26"/>
+          </w:rPr>
+          <w:t>https://github.com/Dieenj/flappy_bird</w:t>
+        </w:r>
+      </w:hyperlink>
+      <w:r>
+        <w:rPr>
+          <w:sz w:val="26"/>
+          <w:szCs w:val="26"/>
+        </w:rPr>
+        <w:t xml:space="preserve"> </w:t>
+      </w:r>
+      <w:r>
+        <w:rPr>
+          <w:sz w:val="26"/>
+          <w:szCs w:val="26"/>
+        </w:rPr>
+        <w:t>(kèm file README.md hư</w:t>
+      </w:r>
+      <w:r>
+        <w:rPr>
+          <w:sz w:val="26"/>
+          <w:szCs w:val="26"/>
+        </w:rPr>
+        <w:t>ớ</w:t>
+      </w:r>
+      <w:r>
+        <w:rPr>
+          <w:sz w:val="26"/>
+          <w:szCs w:val="26"/>
+        </w:rPr>
+        <w:t>ng d</w:t>
+      </w:r>
+      <w:r>
+        <w:rPr>
+          <w:sz w:val="26"/>
+          <w:szCs w:val="26"/>
+        </w:rPr>
+        <w:t>ẫ</w:t>
+      </w:r>
+      <w:r>
+        <w:rPr>
+          <w:sz w:val="26"/>
+          <w:szCs w:val="26"/>
+        </w:rPr>
+        <w:t>n cài đ</w:t>
+      </w:r>
+      <w:r>
+        <w:rPr>
+          <w:sz w:val="26"/>
+          <w:szCs w:val="26"/>
+        </w:rPr>
+        <w:t>ặ</w:t>
+      </w:r>
+      <w:r>
+        <w:rPr>
+          <w:sz w:val="26"/>
+          <w:szCs w:val="26"/>
+        </w:rPr>
+        <w:t>t)</w:t>
       </w:r>
     </w:p>
     <w:p>
@@ -9755,37 +9674,117 @@
         <w:rPr>
           <w:rFonts w:eastAsia="Times New Roman"/>
         </w:rPr>
-        <w:t>3.3. Đóng góp của từng thành viên</w:t>
+        <w:t>3.3. Đóng góp của thành viên</w:t>
       </w:r>
     </w:p>
     <w:p>
       <w:pPr>
-        <w:pStyle w:val="placeholder"/>
-        <w:rPr>
-          <w:sz w:val="26"/>
-          <w:szCs w:val="26"/>
-        </w:rPr>
-      </w:pPr>
-      <w:r>
-        <w:rPr>
-          <w:sz w:val="26"/>
-          <w:szCs w:val="26"/>
-        </w:rPr>
-        <w:t>(Đi</w:t>
-      </w:r>
-      <w:r>
-        <w:rPr>
-          <w:sz w:val="26"/>
-          <w:szCs w:val="26"/>
-        </w:rPr>
-        <w:t>ề</w:t>
-      </w:r>
-      <w:r>
-        <w:rPr>
-          <w:sz w:val="26"/>
-          <w:szCs w:val="26"/>
-        </w:rPr>
-        <w:t>n theo th</w:t>
+        <w:pStyle w:val="NormalWeb"/>
+        <w:rPr>
+          <w:sz w:val="26"/>
+          <w:szCs w:val="26"/>
+        </w:rPr>
+      </w:pPr>
+      <w:r>
+        <w:rPr>
+          <w:sz w:val="26"/>
+          <w:szCs w:val="26"/>
+        </w:rPr>
+        <w:t>Project do m</w:t>
+      </w:r>
+      <w:r>
+        <w:rPr>
+          <w:sz w:val="26"/>
+          <w:szCs w:val="26"/>
+        </w:rPr>
+        <w:t>ộ</w:t>
+      </w:r>
+      <w:r>
+        <w:rPr>
+          <w:sz w:val="26"/>
+          <w:szCs w:val="26"/>
+        </w:rPr>
+        <w:t>t thành viên duy nh</w:t>
+      </w:r>
+      <w:r>
+        <w:rPr>
+          <w:sz w:val="26"/>
+          <w:szCs w:val="26"/>
+        </w:rPr>
+        <w:t>ấ</w:t>
+      </w:r>
+      <w:r>
+        <w:rPr>
+          <w:sz w:val="26"/>
+          <w:szCs w:val="26"/>
+        </w:rPr>
+        <w:t>t —</w:t>
+      </w:r>
+      <w:r>
+        <w:rPr>
+          <w:sz w:val="26"/>
+          <w:szCs w:val="26"/>
+        </w:rPr>
+        <w:t xml:space="preserve"> </w:t>
+      </w:r>
+      <w:r>
+        <w:rPr>
+          <w:b/>
+          <w:bCs/>
+          <w:sz w:val="26"/>
+          <w:szCs w:val="26"/>
+        </w:rPr>
+        <w:t>Nguy</w:t>
+      </w:r>
+      <w:r>
+        <w:rPr>
+          <w:b/>
+          <w:bCs/>
+          <w:sz w:val="26"/>
+          <w:szCs w:val="26"/>
+        </w:rPr>
+        <w:t>ễ</w:t>
+      </w:r>
+      <w:r>
+        <w:rPr>
+          <w:b/>
+          <w:bCs/>
+          <w:sz w:val="26"/>
+          <w:szCs w:val="26"/>
+        </w:rPr>
+        <w:t>n Đăng Di</w:t>
+      </w:r>
+      <w:r>
+        <w:rPr>
+          <w:b/>
+          <w:bCs/>
+          <w:sz w:val="26"/>
+          <w:szCs w:val="26"/>
+        </w:rPr>
+        <w:t>ệ</w:t>
+      </w:r>
+      <w:r>
+        <w:rPr>
+          <w:b/>
+          <w:bCs/>
+          <w:sz w:val="26"/>
+          <w:szCs w:val="26"/>
+        </w:rPr>
+        <w:t>n (20225805)</w:t>
+      </w:r>
+      <w:r>
+        <w:rPr>
+          <w:sz w:val="26"/>
+          <w:szCs w:val="26"/>
+        </w:rPr>
+        <w:t xml:space="preserve"> </w:t>
+      </w:r>
+      <w:r>
+        <w:rPr>
+          <w:sz w:val="26"/>
+          <w:szCs w:val="26"/>
+        </w:rPr>
+        <w:t>— th</w:t>
       </w:r>
       <w:r>
         <w:rPr>
@@ -9799,21 +9798,63 @@
           <w:sz w:val="26"/>
           <w:szCs w:val="26"/>
         </w:rPr>
-        <w:t>c t</w:t>
-      </w:r>
-      <w:r>
-        <w:rPr>
-          <w:sz w:val="26"/>
-          <w:szCs w:val="26"/>
-        </w:rPr>
-        <w:t>ế</w:t>
-      </w:r>
-      <w:r>
-        <w:rPr>
-          <w:sz w:val="26"/>
-          <w:szCs w:val="26"/>
-        </w:rPr>
-        <w:t xml:space="preserve"> nhóm — th</w:t>
+        <w:t>c hi</w:t>
+      </w:r>
+      <w:r>
+        <w:rPr>
+          <w:sz w:val="26"/>
+          <w:szCs w:val="26"/>
+        </w:rPr>
+        <w:t>ệ</w:t>
+      </w:r>
+      <w:r>
+        <w:rPr>
+          <w:sz w:val="26"/>
+          <w:szCs w:val="26"/>
+        </w:rPr>
+        <w:t>n toàn b</w:t>
+      </w:r>
+      <w:r>
+        <w:rPr>
+          <w:sz w:val="26"/>
+          <w:szCs w:val="26"/>
+        </w:rPr>
+        <w:t>ộ</w:t>
+      </w:r>
+      <w:r>
+        <w:rPr>
+          <w:sz w:val="26"/>
+          <w:szCs w:val="26"/>
+        </w:rPr>
+        <w:t xml:space="preserve"> các ph</w:t>
+      </w:r>
+      <w:r>
+        <w:rPr>
+          <w:sz w:val="26"/>
+          <w:szCs w:val="26"/>
+        </w:rPr>
+        <w:t>ầ</w:t>
+      </w:r>
+      <w:r>
+        <w:rPr>
+          <w:sz w:val="26"/>
+          <w:szCs w:val="26"/>
+        </w:rPr>
+        <w:t>n vi</w:t>
+      </w:r>
+      <w:r>
+        <w:rPr>
+          <w:sz w:val="26"/>
+          <w:szCs w:val="26"/>
+        </w:rPr>
+        <w:t>ệ</w:t>
+      </w:r>
+      <w:r>
+        <w:rPr>
+          <w:sz w:val="26"/>
+          <w:szCs w:val="26"/>
+        </w:rPr>
+        <w:t>c (th</w:t>
       </w:r>
       <w:r>
         <w:rPr>
@@ -9841,21 +9882,7 @@
           <w:sz w:val="26"/>
           <w:szCs w:val="26"/>
         </w:rPr>
-        <w:t xml:space="preserve">n tương </w:t>
-      </w:r>
-      <w:r>
-        <w:rPr>
-          <w:sz w:val="26"/>
-          <w:szCs w:val="26"/>
-        </w:rPr>
-        <w:t>ứ</w:t>
-      </w:r>
-      <w:r>
-        <w:rPr>
-          <w:sz w:val="26"/>
-          <w:szCs w:val="26"/>
-        </w:rPr>
-        <w:t xml:space="preserve">ng </w:t>
+        <w:t xml:space="preserve">n </w:t>
       </w:r>
       <w:r>
         <w:rPr>
@@ -9869,7 +9896,7 @@
           <w:sz w:val="26"/>
           <w:szCs w:val="26"/>
         </w:rPr>
-        <w:t xml:space="preserve"> s</w:t>
+        <w:t xml:space="preserve"> 100% s</w:t>
       </w:r>
       <w:r>
         <w:rPr>
@@ -9883,7 +9910,7 @@
           <w:sz w:val="26"/>
           <w:szCs w:val="26"/>
         </w:rPr>
-        <w:t xml:space="preserve"> commit trên GitHub)</w:t>
+        <w:t xml:space="preserve"> commit trên GitHub):</w:t>
       </w:r>
     </w:p>
     <w:tbl>
@@ -9898,9 +9925,8 @@
         <w:tblLook w:val="04A0" w:firstRow="1" w:lastRow="0" w:firstColumn="1" w:lastColumn="0" w:noHBand="0" w:noVBand="1"/>
       </w:tblPr>
       <w:tblGrid>
-        <w:gridCol w:w="1418"/>
-        <w:gridCol w:w="6590"/>
-        <w:gridCol w:w="1336"/>
+        <w:gridCol w:w="2105"/>
+        <w:gridCol w:w="7239"/>
       </w:tblGrid>
       <w:tr>
         <w:tc>
@@ -9937,7 +9963,7 @@
                 <w:b/>
                 <w:bCs/>
               </w:rPr>
-              <w:t>Thành viên</w:t>
+              <w:t>Phần việc</w:t>
             </w:r>
           </w:p>
         </w:tc>
@@ -9975,45 +10001,7 @@
                 <w:b/>
                 <w:bCs/>
               </w:rPr>
-              <w:t>Công việc</w:t>
-            </w:r>
-          </w:p>
-        </w:tc>
-        <w:tc>
-          <w:tcPr>
-            <w:tcW w:w="0" w:type="auto"/>
-            <w:tcBorders>
-              <w:top w:val="single" w:sz="6" w:space="0" w:color="444444"/>
-              <w:left w:val="single" w:sz="6" w:space="0" w:color="444444"/>
-              <w:bottom w:val="single" w:sz="6" w:space="0" w:color="444444"/>
-              <w:right w:val="single" w:sz="6" w:space="0" w:color="444444"/>
-            </w:tcBorders>
-            <w:shd w:val="clear" w:color="auto" w:fill="E8E8E8"/>
-            <w:tcMar>
-              <w:top w:w="80" w:type="dxa"/>
-              <w:left w:w="120" w:type="dxa"/>
-              <w:bottom w:w="80" w:type="dxa"/>
-              <w:right w:w="120" w:type="dxa"/>
-            </w:tcMar>
-            <w:hideMark/>
-          </w:tcPr>
-          <w:p>
-            <w:pPr>
-              <w:spacing w:before="160" w:after="160"/>
-              <w:jc w:val="center"/>
-              <w:rPr>
-                <w:rFonts w:eastAsia="Times New Roman"/>
-                <w:b/>
-                <w:bCs/>
-              </w:rPr>
-            </w:pPr>
-            <w:r>
-              <w:rPr>
-                <w:rFonts w:eastAsia="Times New Roman"/>
-                <w:b/>
-                <w:bCs/>
-              </w:rPr>
-              <w:t>Số commit</w:t>
+              <w:t>Nội dung</w:t>
             </w:r>
           </w:p>
         </w:tc>
@@ -10041,78 +10029,46 @@
               <w:spacing w:before="160" w:after="160"/>
               <w:rPr>
                 <w:rFonts w:eastAsia="Times New Roman"/>
-                <w:i/>
-                <w:iCs/>
-                <w:color w:val="CC0000"/>
-              </w:rPr>
-            </w:pPr>
-            <w:r>
-              <w:rPr>
-                <w:rFonts w:eastAsia="Times New Roman"/>
-                <w:i/>
-                <w:iCs/>
-                <w:color w:val="CC0000"/>
-              </w:rPr>
-              <w:t>(Tên 1)</w:t>
-            </w:r>
-          </w:p>
-        </w:tc>
-        <w:tc>
-          <w:tcPr>
-            <w:tcW w:w="0" w:type="auto"/>
-            <w:tcBorders>
-              <w:top w:val="single" w:sz="6" w:space="0" w:color="444444"/>
-              <w:left w:val="single" w:sz="6" w:space="0" w:color="444444"/>
-              <w:bottom w:val="single" w:sz="6" w:space="0" w:color="444444"/>
-              <w:right w:val="single" w:sz="6" w:space="0" w:color="444444"/>
-            </w:tcBorders>
-            <w:tcMar>
-              <w:top w:w="80" w:type="dxa"/>
-              <w:left w:w="120" w:type="dxa"/>
-              <w:bottom w:w="80" w:type="dxa"/>
-              <w:right w:w="120" w:type="dxa"/>
-            </w:tcMar>
-            <w:hideMark/>
-          </w:tcPr>
-          <w:p>
-            <w:pPr>
-              <w:spacing w:before="160" w:after="160"/>
-              <w:rPr>
-                <w:rFonts w:eastAsia="Times New Roman"/>
-              </w:rPr>
-            </w:pPr>
-            <w:r>
-              <w:rPr>
-                <w:rFonts w:eastAsia="Times New Roman"/>
-              </w:rPr>
-              <w:t>Game engine: vật lý, va chạm, cấp độ, máy trạng thái</w:t>
-            </w:r>
-          </w:p>
-        </w:tc>
-        <w:tc>
-          <w:tcPr>
-            <w:tcW w:w="0" w:type="auto"/>
-            <w:tcBorders>
-              <w:top w:val="single" w:sz="6" w:space="0" w:color="444444"/>
-              <w:left w:val="single" w:sz="6" w:space="0" w:color="444444"/>
-              <w:bottom w:val="single" w:sz="6" w:space="0" w:color="444444"/>
-              <w:right w:val="single" w:sz="6" w:space="0" w:color="444444"/>
-            </w:tcBorders>
-            <w:tcMar>
-              <w:top w:w="80" w:type="dxa"/>
-              <w:left w:w="120" w:type="dxa"/>
-              <w:bottom w:w="80" w:type="dxa"/>
-              <w:right w:w="120" w:type="dxa"/>
-            </w:tcMar>
-            <w:hideMark/>
-          </w:tcPr>
-          <w:p>
-            <w:pPr>
-              <w:spacing w:before="160" w:after="160"/>
-              <w:rPr>
-                <w:rFonts w:eastAsia="Times New Roman"/>
-              </w:rPr>
-            </w:pPr>
+              </w:rPr>
+            </w:pPr>
+            <w:r>
+              <w:rPr>
+                <w:rFonts w:eastAsia="Times New Roman"/>
+              </w:rPr>
+              <w:t>Game engine</w:t>
+            </w:r>
+          </w:p>
+        </w:tc>
+        <w:tc>
+          <w:tcPr>
+            <w:tcW w:w="0" w:type="auto"/>
+            <w:tcBorders>
+              <w:top w:val="single" w:sz="6" w:space="0" w:color="444444"/>
+              <w:left w:val="single" w:sz="6" w:space="0" w:color="444444"/>
+              <w:bottom w:val="single" w:sz="6" w:space="0" w:color="444444"/>
+              <w:right w:val="single" w:sz="6" w:space="0" w:color="444444"/>
+            </w:tcBorders>
+            <w:tcMar>
+              <w:top w:w="80" w:type="dxa"/>
+              <w:left w:w="120" w:type="dxa"/>
+              <w:bottom w:w="80" w:type="dxa"/>
+              <w:right w:w="120" w:type="dxa"/>
+            </w:tcMar>
+            <w:hideMark/>
+          </w:tcPr>
+          <w:p>
+            <w:pPr>
+              <w:spacing w:before="160" w:after="160"/>
+              <w:rPr>
+                <w:rFonts w:eastAsia="Times New Roman"/>
+              </w:rPr>
+            </w:pPr>
+            <w:r>
+              <w:rPr>
+                <w:rFonts w:eastAsia="Times New Roman"/>
+              </w:rPr>
+              <w:t>Vật lý chim, va chạm, hệ thống 6 cấp độ, máy trạng thái, PRNG</w:t>
+            </w:r>
           </w:p>
         </w:tc>
       </w:tr>
@@ -10139,78 +10095,46 @@
               <w:spacing w:before="160" w:after="160"/>
               <w:rPr>
                 <w:rFonts w:eastAsia="Times New Roman"/>
-                <w:i/>
-                <w:iCs/>
-                <w:color w:val="CC0000"/>
-              </w:rPr>
-            </w:pPr>
-            <w:r>
-              <w:rPr>
-                <w:rFonts w:eastAsia="Times New Roman"/>
-                <w:i/>
-                <w:iCs/>
-                <w:color w:val="CC0000"/>
-              </w:rPr>
-              <w:t>(Tên 2)</w:t>
-            </w:r>
-          </w:p>
-        </w:tc>
-        <w:tc>
-          <w:tcPr>
-            <w:tcW w:w="0" w:type="auto"/>
-            <w:tcBorders>
-              <w:top w:val="single" w:sz="6" w:space="0" w:color="444444"/>
-              <w:left w:val="single" w:sz="6" w:space="0" w:color="444444"/>
-              <w:bottom w:val="single" w:sz="6" w:space="0" w:color="444444"/>
-              <w:right w:val="single" w:sz="6" w:space="0" w:color="444444"/>
-            </w:tcBorders>
-            <w:tcMar>
-              <w:top w:w="80" w:type="dxa"/>
-              <w:left w:w="120" w:type="dxa"/>
-              <w:bottom w:w="80" w:type="dxa"/>
-              <w:right w:w="120" w:type="dxa"/>
-            </w:tcMar>
-            <w:hideMark/>
-          </w:tcPr>
-          <w:p>
-            <w:pPr>
-              <w:spacing w:before="160" w:after="160"/>
-              <w:rPr>
-                <w:rFonts w:eastAsia="Times New Roman"/>
-              </w:rPr>
-            </w:pPr>
-            <w:r>
-              <w:rPr>
-                <w:rFonts w:eastAsia="Times New Roman"/>
-              </w:rPr>
-              <w:t>UI TouchGFX: thiết kế màn hình, GameView, animation</w:t>
-            </w:r>
-          </w:p>
-        </w:tc>
-        <w:tc>
-          <w:tcPr>
-            <w:tcW w:w="0" w:type="auto"/>
-            <w:tcBorders>
-              <w:top w:val="single" w:sz="6" w:space="0" w:color="444444"/>
-              <w:left w:val="single" w:sz="6" w:space="0" w:color="444444"/>
-              <w:bottom w:val="single" w:sz="6" w:space="0" w:color="444444"/>
-              <w:right w:val="single" w:sz="6" w:space="0" w:color="444444"/>
-            </w:tcBorders>
-            <w:tcMar>
-              <w:top w:w="80" w:type="dxa"/>
-              <w:left w:w="120" w:type="dxa"/>
-              <w:bottom w:w="80" w:type="dxa"/>
-              <w:right w:w="120" w:type="dxa"/>
-            </w:tcMar>
-            <w:hideMark/>
-          </w:tcPr>
-          <w:p>
-            <w:pPr>
-              <w:spacing w:before="160" w:after="160"/>
-              <w:rPr>
-                <w:rFonts w:eastAsia="Times New Roman"/>
-              </w:rPr>
-            </w:pPr>
+              </w:rPr>
+            </w:pPr>
+            <w:r>
+              <w:rPr>
+                <w:rFonts w:eastAsia="Times New Roman"/>
+              </w:rPr>
+              <w:t>UI TouchGFX</w:t>
+            </w:r>
+          </w:p>
+        </w:tc>
+        <w:tc>
+          <w:tcPr>
+            <w:tcW w:w="0" w:type="auto"/>
+            <w:tcBorders>
+              <w:top w:val="single" w:sz="6" w:space="0" w:color="444444"/>
+              <w:left w:val="single" w:sz="6" w:space="0" w:color="444444"/>
+              <w:bottom w:val="single" w:sz="6" w:space="0" w:color="444444"/>
+              <w:right w:val="single" w:sz="6" w:space="0" w:color="444444"/>
+            </w:tcBorders>
+            <w:tcMar>
+              <w:top w:w="80" w:type="dxa"/>
+              <w:left w:w="120" w:type="dxa"/>
+              <w:bottom w:w="80" w:type="dxa"/>
+              <w:right w:w="120" w:type="dxa"/>
+            </w:tcMar>
+            <w:hideMark/>
+          </w:tcPr>
+          <w:p>
+            <w:pPr>
+              <w:spacing w:before="160" w:after="160"/>
+              <w:rPr>
+                <w:rFonts w:eastAsia="Times New Roman"/>
+              </w:rPr>
+            </w:pPr>
+            <w:r>
+              <w:rPr>
+                <w:rFonts w:eastAsia="Times New Roman"/>
+              </w:rPr>
+              <w:t>Thiết kế các màn hình, GameView, animation vỗ cánh, overlay</w:t>
+            </w:r>
           </w:p>
         </w:tc>
       </w:tr>
@@ -10237,78 +10161,46 @@
               <w:spacing w:before="160" w:after="160"/>
               <w:rPr>
                 <w:rFonts w:eastAsia="Times New Roman"/>
-                <w:i/>
-                <w:iCs/>
-                <w:color w:val="CC0000"/>
-              </w:rPr>
-            </w:pPr>
-            <w:r>
-              <w:rPr>
-                <w:rFonts w:eastAsia="Times New Roman"/>
-                <w:i/>
-                <w:iCs/>
-                <w:color w:val="CC0000"/>
-              </w:rPr>
-              <w:t>(Tên 3)</w:t>
-            </w:r>
-          </w:p>
-        </w:tc>
-        <w:tc>
-          <w:tcPr>
-            <w:tcW w:w="0" w:type="auto"/>
-            <w:tcBorders>
-              <w:top w:val="single" w:sz="6" w:space="0" w:color="444444"/>
-              <w:left w:val="single" w:sz="6" w:space="0" w:color="444444"/>
-              <w:bottom w:val="single" w:sz="6" w:space="0" w:color="444444"/>
-              <w:right w:val="single" w:sz="6" w:space="0" w:color="444444"/>
-            </w:tcBorders>
-            <w:tcMar>
-              <w:top w:w="80" w:type="dxa"/>
-              <w:left w:w="120" w:type="dxa"/>
-              <w:bottom w:w="80" w:type="dxa"/>
-              <w:right w:w="120" w:type="dxa"/>
-            </w:tcMar>
-            <w:hideMark/>
-          </w:tcPr>
-          <w:p>
-            <w:pPr>
-              <w:spacing w:before="160" w:after="160"/>
-              <w:rPr>
-                <w:rFonts w:eastAsia="Times New Roman"/>
-              </w:rPr>
-            </w:pPr>
-            <w:r>
-              <w:rPr>
-                <w:rFonts w:eastAsia="Times New Roman"/>
-              </w:rPr>
-              <w:t>Phần cứng/hệ thống: CubeMX, FreeRTOS, PA0, LED, nạp board</w:t>
-            </w:r>
-          </w:p>
-        </w:tc>
-        <w:tc>
-          <w:tcPr>
-            <w:tcW w:w="0" w:type="auto"/>
-            <w:tcBorders>
-              <w:top w:val="single" w:sz="6" w:space="0" w:color="444444"/>
-              <w:left w:val="single" w:sz="6" w:space="0" w:color="444444"/>
-              <w:bottom w:val="single" w:sz="6" w:space="0" w:color="444444"/>
-              <w:right w:val="single" w:sz="6" w:space="0" w:color="444444"/>
-            </w:tcBorders>
-            <w:tcMar>
-              <w:top w:w="80" w:type="dxa"/>
-              <w:left w:w="120" w:type="dxa"/>
-              <w:bottom w:w="80" w:type="dxa"/>
-              <w:right w:w="120" w:type="dxa"/>
-            </w:tcMar>
-            <w:hideMark/>
-          </w:tcPr>
-          <w:p>
-            <w:pPr>
-              <w:spacing w:before="160" w:after="160"/>
-              <w:rPr>
-                <w:rFonts w:eastAsia="Times New Roman"/>
-              </w:rPr>
-            </w:pPr>
+              </w:rPr>
+            </w:pPr>
+            <w:r>
+              <w:rPr>
+                <w:rFonts w:eastAsia="Times New Roman"/>
+              </w:rPr>
+              <w:t>Phần cứng / hệ thống</w:t>
+            </w:r>
+          </w:p>
+        </w:tc>
+        <w:tc>
+          <w:tcPr>
+            <w:tcW w:w="0" w:type="auto"/>
+            <w:tcBorders>
+              <w:top w:val="single" w:sz="6" w:space="0" w:color="444444"/>
+              <w:left w:val="single" w:sz="6" w:space="0" w:color="444444"/>
+              <w:bottom w:val="single" w:sz="6" w:space="0" w:color="444444"/>
+              <w:right w:val="single" w:sz="6" w:space="0" w:color="444444"/>
+            </w:tcBorders>
+            <w:tcMar>
+              <w:top w:w="80" w:type="dxa"/>
+              <w:left w:w="120" w:type="dxa"/>
+              <w:bottom w:w="80" w:type="dxa"/>
+              <w:right w:w="120" w:type="dxa"/>
+            </w:tcMar>
+            <w:hideMark/>
+          </w:tcPr>
+          <w:p>
+            <w:pPr>
+              <w:spacing w:before="160" w:after="160"/>
+              <w:rPr>
+                <w:rFonts w:eastAsia="Times New Roman"/>
+              </w:rPr>
+            </w:pPr>
+            <w:r>
+              <w:rPr>
+                <w:rFonts w:eastAsia="Times New Roman"/>
+              </w:rPr>
+              <w:t>Cấu hình CubeMX (LTDC, DMA2D, FMC, I2C3, SPI5...), FreeRTOS, nút PA0, LED</w:t>
+            </w:r>
           </w:p>
         </w:tc>
       </w:tr>
@@ -10335,78 +10227,46 @@
               <w:spacing w:before="160" w:after="160"/>
               <w:rPr>
                 <w:rFonts w:eastAsia="Times New Roman"/>
-                <w:i/>
-                <w:iCs/>
-                <w:color w:val="CC0000"/>
-              </w:rPr>
-            </w:pPr>
-            <w:r>
-              <w:rPr>
-                <w:rFonts w:eastAsia="Times New Roman"/>
-                <w:i/>
-                <w:iCs/>
-                <w:color w:val="CC0000"/>
-              </w:rPr>
-              <w:t>(Tên 4)</w:t>
-            </w:r>
-          </w:p>
-        </w:tc>
-        <w:tc>
-          <w:tcPr>
-            <w:tcW w:w="0" w:type="auto"/>
-            <w:tcBorders>
-              <w:top w:val="single" w:sz="6" w:space="0" w:color="444444"/>
-              <w:left w:val="single" w:sz="6" w:space="0" w:color="444444"/>
-              <w:bottom w:val="single" w:sz="6" w:space="0" w:color="444444"/>
-              <w:right w:val="single" w:sz="6" w:space="0" w:color="444444"/>
-            </w:tcBorders>
-            <w:tcMar>
-              <w:top w:w="80" w:type="dxa"/>
-              <w:left w:w="120" w:type="dxa"/>
-              <w:bottom w:w="80" w:type="dxa"/>
-              <w:right w:w="120" w:type="dxa"/>
-            </w:tcMar>
-            <w:hideMark/>
-          </w:tcPr>
-          <w:p>
-            <w:pPr>
-              <w:spacing w:before="160" w:after="160"/>
-              <w:rPr>
-                <w:rFonts w:eastAsia="Times New Roman"/>
-              </w:rPr>
-            </w:pPr>
-            <w:r>
-              <w:rPr>
-                <w:rFonts w:eastAsia="Times New Roman"/>
-              </w:rPr>
-              <w:t>Kiểm thử, quay demo, viết báo cáo &amp; README</w:t>
-            </w:r>
-          </w:p>
-        </w:tc>
-        <w:tc>
-          <w:tcPr>
-            <w:tcW w:w="0" w:type="auto"/>
-            <w:tcBorders>
-              <w:top w:val="single" w:sz="6" w:space="0" w:color="444444"/>
-              <w:left w:val="single" w:sz="6" w:space="0" w:color="444444"/>
-              <w:bottom w:val="single" w:sz="6" w:space="0" w:color="444444"/>
-              <w:right w:val="single" w:sz="6" w:space="0" w:color="444444"/>
-            </w:tcBorders>
-            <w:tcMar>
-              <w:top w:w="80" w:type="dxa"/>
-              <w:left w:w="120" w:type="dxa"/>
-              <w:bottom w:w="80" w:type="dxa"/>
-              <w:right w:w="120" w:type="dxa"/>
-            </w:tcMar>
-            <w:hideMark/>
-          </w:tcPr>
-          <w:p>
-            <w:pPr>
-              <w:spacing w:before="160" w:after="160"/>
-              <w:rPr>
-                <w:rFonts w:eastAsia="Times New Roman"/>
-              </w:rPr>
-            </w:pPr>
+              </w:rPr>
+            </w:pPr>
+            <w:r>
+              <w:rPr>
+                <w:rFonts w:eastAsia="Times New Roman"/>
+              </w:rPr>
+              <w:t>Hoàn thiện</w:t>
+            </w:r>
+          </w:p>
+        </w:tc>
+        <w:tc>
+          <w:tcPr>
+            <w:tcW w:w="0" w:type="auto"/>
+            <w:tcBorders>
+              <w:top w:val="single" w:sz="6" w:space="0" w:color="444444"/>
+              <w:left w:val="single" w:sz="6" w:space="0" w:color="444444"/>
+              <w:bottom w:val="single" w:sz="6" w:space="0" w:color="444444"/>
+              <w:right w:val="single" w:sz="6" w:space="0" w:color="444444"/>
+            </w:tcBorders>
+            <w:tcMar>
+              <w:top w:w="80" w:type="dxa"/>
+              <w:left w:w="120" w:type="dxa"/>
+              <w:bottom w:w="80" w:type="dxa"/>
+              <w:right w:w="120" w:type="dxa"/>
+            </w:tcMar>
+            <w:hideMark/>
+          </w:tcPr>
+          <w:p>
+            <w:pPr>
+              <w:spacing w:before="160" w:after="160"/>
+              <w:rPr>
+                <w:rFonts w:eastAsia="Times New Roman"/>
+              </w:rPr>
+            </w:pPr>
+            <w:r>
+              <w:rPr>
+                <w:rFonts w:eastAsia="Times New Roman"/>
+              </w:rPr>
+              <w:t>Kiểm thử trên simulator và board, quay demo, viết báo cáo &amp; README</w:t>
+            </w:r>
           </w:p>
         </w:tc>
       </w:tr>
@@ -11024,7 +10884,23 @@
           <w:sz w:val="26"/>
           <w:szCs w:val="26"/>
         </w:rPr>
-        <w:t>Kiến trúc sạch: logic game tách hoàn toàn khỏi HAL → dễ test trên PC, dễ port.</w:t>
+        <w:t>Kiến trúc sạch: logic game tách hoàn toàn khỏi</w:t>
+      </w:r>
+      <w:r>
+        <w:rPr>
+          <w:rFonts w:eastAsia="Times New Roman"/>
+          <w:sz w:val="26"/>
+          <w:szCs w:val="26"/>
+        </w:rPr>
+        <w:t xml:space="preserve"> </w:t>
+      </w:r>
+      <w:r>
+        <w:rPr>
+          <w:rFonts w:eastAsia="Times New Roman"/>
+          <w:sz w:val="26"/>
+          <w:szCs w:val="26"/>
+        </w:rPr>
+        <w:t>HAL → dễ test trên PC, dễ port.</w:t>
       </w:r>
     </w:p>
     <w:p>
@@ -11344,9 +11220,122 @@
 <file path=word/numbering.xml><?xml version="1.0" encoding="utf-8"?>
 <w:numbering xmlns:wpc="http://schemas.microsoft.com/office/word/2010/wordprocessingCanvas" xmlns:cx="http://schemas.microsoft.com/office/drawing/2014/chartex" xmlns:cx1="http://schemas.microsoft.com/office/drawing/2015/9/8/chartex" xmlns:cx2="http://schemas.microsoft.com/office/drawing/2015/10/21/chartex" xmlns:cx3="http://schemas.microsoft.com/office/drawing/2016/5/9/chartex" xmlns:cx4="http://schemas.microsoft.com/office/drawing/2016/5/10/chartex" xmlns:cx5="http://schemas.microsoft.com/office/drawing/2016/5/11/chartex" xmlns:cx6="http://schemas.microsoft.com/office/drawing/2016/5/12/chartex" xmlns:cx7="http://schemas.microsoft.com/office/drawing/2016/5/13/chartex" xmlns:cx8="http://schemas.microsoft.com/office/drawing/2016/5/14/chartex" xmlns:mc="http://schemas.openxmlformats.org/markup-compatibility/2006" xmlns:aink="http://schemas.microsoft.com/office/drawing/2016/ink" xmlns:am3d="http://schemas.microsoft.com/office/drawing/2017/model3d" xmlns:o="urn:schemas-microsoft-com:office:office" xmlns:oel="http://schemas.microsoft.com/office/2019/extlst" xmlns:r="http://schemas.openxmlformats.org/officeDocument/2006/relationships" xmlns:m="http://schemas.openxmlformats.org/officeDocument/2006/math" xmlns:v="urn:schemas-microsoft-com:vml" xmlns:wp14="http://schemas.microsoft.com/office/word/2010/wordprocessingDrawing" xmlns:wp="http://schemas.openxmlformats.org/drawingml/2006/wordprocessingDrawing" xmlns:w10="urn:schemas-microsoft-com:office:word" xmlns:w="http://schemas.openxmlformats.org/wordprocessingml/2006/main" xmlns:w14="http://schemas.microsoft.com/office/word/2010/wordml" xmlns:w15="http://schemas.microsoft.com/office/word/2012/wordml" xmlns:w16cex="http://schemas.microsoft.com/office/word/2018/wordml/cex" xmlns:w16cid="http://schemas.microsoft.com/office/word/2016/wordml/cid" xmlns:w16="http://schemas.microsoft.com/office/word/2018/wordml" xmlns:w16du="http://schemas.microsoft.com/office/word/2023/wordml/word16du" xmlns:w16sdtdh="http://schemas.microsoft.com/office/word/2020/wordml/sdtdatahash" xmlns:w16sdtfl="http://schemas.microsoft.com/office/word/2024/wordml/sdtformatlock" xmlns:w16se="http://schemas.microsoft.com/office/word/2015/wordml/symex" xmlns:wpg="http://schemas.microsoft.com/office/word/2010/wordprocessingGroup" xmlns:wpi="http://schemas.microsoft.com/office/word/2010/wordprocessingInk" xmlns:wne="http://schemas.microsoft.com/office/word/2006/wordml" xmlns:wps="http://schemas.microsoft.com/office/word/2010/wordprocessingShape" mc:Ignorable="w14 w15 w16se w16cid w16 w16cex w16sdtdh w16sdtfl w16du wp14">
   <w:abstractNum w:abstractNumId="0" w15:restartNumberingAfterBreak="0">
-    <w:nsid w:val="159657F0"/>
+    <w:nsid w:val="039C1472"/>
     <w:multiLevelType w:val="multilevel"/>
-    <w:tmpl w:val="578E4FAA"/>
+    <w:tmpl w:val="2458A90A"/>
+    <w:lvl w:ilvl="0">
+      <w:start w:val="1"/>
+      <w:numFmt w:val="decimal"/>
+      <w:lvlText w:val="%1."/>
+      <w:lvlJc w:val="left"/>
+      <w:pPr>
+        <w:tabs>
+          <w:tab w:val="num" w:pos="720"/>
+        </w:tabs>
+        <w:ind w:left="720" w:hanging="360"/>
+      </w:pPr>
+    </w:lvl>
+    <w:lvl w:ilvl="1" w:tentative="1">
+      <w:start w:val="1"/>
+      <w:numFmt w:val="decimal"/>
+      <w:lvlText w:val="%2."/>
+      <w:lvlJc w:val="left"/>
+      <w:pPr>
+        <w:tabs>
+          <w:tab w:val="num" w:pos="1440"/>
+        </w:tabs>
+        <w:ind w:left="1440" w:hanging="360"/>
+      </w:pPr>
+    </w:lvl>
+    <w:lvl w:ilvl="2" w:tentative="1">
+      <w:start w:val="1"/>
+      <w:numFmt w:val="decimal"/>
+      <w:lvlText w:val="%3."/>
+      <w:lvlJc w:val="left"/>
+      <w:pPr>
+        <w:tabs>
+          <w:tab w:val="num" w:pos="2160"/>
+        </w:tabs>
+        <w:ind w:left="2160" w:hanging="360"/>
+      </w:pPr>
+    </w:lvl>
+    <w:lvl w:ilvl="3" w:tentative="1">
+      <w:start w:val="1"/>
+      <w:numFmt w:val="decimal"/>
+      <w:lvlText w:val="%4."/>
+      <w:lvlJc w:val="left"/>
+      <w:pPr>
+        <w:tabs>
+          <w:tab w:val="num" w:pos="2880"/>
+        </w:tabs>
+        <w:ind w:left="2880" w:hanging="360"/>
+      </w:pPr>
+    </w:lvl>
+    <w:lvl w:ilvl="4" w:tentative="1">
+      <w:start w:val="1"/>
+      <w:numFmt w:val="decimal"/>
+      <w:lvlText w:val="%5."/>
+      <w:lvlJc w:val="left"/>
+      <w:pPr>
+        <w:tabs>
+          <w:tab w:val="num" w:pos="3600"/>
+        </w:tabs>
+        <w:ind w:left="3600" w:hanging="360"/>
+      </w:pPr>
+    </w:lvl>
+    <w:lvl w:ilvl="5" w:tentative="1">
+      <w:start w:val="1"/>
+      <w:numFmt w:val="decimal"/>
+      <w:lvlText w:val="%6."/>
+      <w:lvlJc w:val="left"/>
+      <w:pPr>
+        <w:tabs>
+          <w:tab w:val="num" w:pos="4320"/>
+        </w:tabs>
+        <w:ind w:left="4320" w:hanging="360"/>
+      </w:pPr>
+    </w:lvl>
+    <w:lvl w:ilvl="6" w:tentative="1">
+      <w:start w:val="1"/>
+      <w:numFmt w:val="decimal"/>
+      <w:lvlText w:val="%7."/>
+      <w:lvlJc w:val="left"/>
+      <w:pPr>
+        <w:tabs>
+          <w:tab w:val="num" w:pos="5040"/>
+        </w:tabs>
+        <w:ind w:left="5040" w:hanging="360"/>
+      </w:pPr>
+    </w:lvl>
+    <w:lvl w:ilvl="7" w:tentative="1">
+      <w:start w:val="1"/>
+      <w:numFmt w:val="decimal"/>
+      <w:lvlText w:val="%8."/>
+      <w:lvlJc w:val="left"/>
+      <w:pPr>
+        <w:tabs>
+          <w:tab w:val="num" w:pos="5760"/>
+        </w:tabs>
+        <w:ind w:left="5760" w:hanging="360"/>
+      </w:pPr>
+    </w:lvl>
+    <w:lvl w:ilvl="8" w:tentative="1">
+      <w:start w:val="1"/>
+      <w:numFmt w:val="decimal"/>
+      <w:lvlText w:val="%9."/>
+      <w:lvlJc w:val="left"/>
+      <w:pPr>
+        <w:tabs>
+          <w:tab w:val="num" w:pos="6480"/>
+        </w:tabs>
+        <w:ind w:left="6480" w:hanging="360"/>
+      </w:pPr>
+    </w:lvl>
+  </w:abstractNum>
+  <w:abstractNum w:abstractNumId="1" w15:restartNumberingAfterBreak="0">
+    <w:nsid w:val="34195BD3"/>
+    <w:multiLevelType w:val="multilevel"/>
+    <w:tmpl w:val="F29E5E26"/>
     <w:lvl w:ilvl="0">
       <w:start w:val="1"/>
       <w:numFmt w:val="bullet"/>
@@ -11492,10 +11481,10 @@
       </w:rPr>
     </w:lvl>
   </w:abstractNum>
-  <w:abstractNum w:abstractNumId="1" w15:restartNumberingAfterBreak="0">
-    <w:nsid w:val="270B194C"/>
+  <w:abstractNum w:abstractNumId="2" w15:restartNumberingAfterBreak="0">
+    <w:nsid w:val="48983BA6"/>
     <w:multiLevelType w:val="multilevel"/>
-    <w:tmpl w:val="52DE5DF2"/>
+    <w:tmpl w:val="FA16A7BA"/>
     <w:lvl w:ilvl="0">
       <w:start w:val="1"/>
       <w:numFmt w:val="bullet"/>
@@ -11641,123 +11630,10 @@
       </w:rPr>
     </w:lvl>
   </w:abstractNum>
-  <w:abstractNum w:abstractNumId="2" w15:restartNumberingAfterBreak="0">
-    <w:nsid w:val="3ED94CC6"/>
+  <w:abstractNum w:abstractNumId="3" w15:restartNumberingAfterBreak="0">
+    <w:nsid w:val="6DB211EC"/>
     <w:multiLevelType w:val="multilevel"/>
-    <w:tmpl w:val="22DA6C4E"/>
-    <w:lvl w:ilvl="0">
-      <w:start w:val="1"/>
-      <w:numFmt w:val="decimal"/>
-      <w:lvlText w:val="%1."/>
-      <w:lvlJc w:val="left"/>
-      <w:pPr>
-        <w:tabs>
-          <w:tab w:val="num" w:pos="720"/>
-        </w:tabs>
-        <w:ind w:left="720" w:hanging="360"/>
-      </w:pPr>
-    </w:lvl>
-    <w:lvl w:ilvl="1" w:tentative="1">
-      <w:start w:val="1"/>
-      <w:numFmt w:val="decimal"/>
-      <w:lvlText w:val="%2."/>
-      <w:lvlJc w:val="left"/>
-      <w:pPr>
-        <w:tabs>
-          <w:tab w:val="num" w:pos="1440"/>
-        </w:tabs>
-        <w:ind w:left="1440" w:hanging="360"/>
-      </w:pPr>
-    </w:lvl>
-    <w:lvl w:ilvl="2" w:tentative="1">
-      <w:start w:val="1"/>
-      <w:numFmt w:val="decimal"/>
-      <w:lvlText w:val="%3."/>
-      <w:lvlJc w:val="left"/>
-      <w:pPr>
-        <w:tabs>
-          <w:tab w:val="num" w:pos="2160"/>
-        </w:tabs>
-        <w:ind w:left="2160" w:hanging="360"/>
-      </w:pPr>
-    </w:lvl>
-    <w:lvl w:ilvl="3" w:tentative="1">
-      <w:start w:val="1"/>
-      <w:numFmt w:val="decimal"/>
-      <w:lvlText w:val="%4."/>
-      <w:lvlJc w:val="left"/>
-      <w:pPr>
-        <w:tabs>
-          <w:tab w:val="num" w:pos="2880"/>
-        </w:tabs>
-        <w:ind w:left="2880" w:hanging="360"/>
-      </w:pPr>
-    </w:lvl>
-    <w:lvl w:ilvl="4" w:tentative="1">
-      <w:start w:val="1"/>
-      <w:numFmt w:val="decimal"/>
-      <w:lvlText w:val="%5."/>
-      <w:lvlJc w:val="left"/>
-      <w:pPr>
-        <w:tabs>
-          <w:tab w:val="num" w:pos="3600"/>
-        </w:tabs>
-        <w:ind w:left="3600" w:hanging="360"/>
-      </w:pPr>
-    </w:lvl>
-    <w:lvl w:ilvl="5" w:tentative="1">
-      <w:start w:val="1"/>
-      <w:numFmt w:val="decimal"/>
-      <w:lvlText w:val="%6."/>
-      <w:lvlJc w:val="left"/>
-      <w:pPr>
-        <w:tabs>
-          <w:tab w:val="num" w:pos="4320"/>
-        </w:tabs>
-        <w:ind w:left="4320" w:hanging="360"/>
-      </w:pPr>
-    </w:lvl>
-    <w:lvl w:ilvl="6" w:tentative="1">
-      <w:start w:val="1"/>
-      <w:numFmt w:val="decimal"/>
-      <w:lvlText w:val="%7."/>
-      <w:lvlJc w:val="left"/>
-      <w:pPr>
-        <w:tabs>
-          <w:tab w:val="num" w:pos="5040"/>
-        </w:tabs>
-        <w:ind w:left="5040" w:hanging="360"/>
-      </w:pPr>
-    </w:lvl>
-    <w:lvl w:ilvl="7" w:tentative="1">
-      <w:start w:val="1"/>
-      <w:numFmt w:val="decimal"/>
-      <w:lvlText w:val="%8."/>
-      <w:lvlJc w:val="left"/>
-      <w:pPr>
-        <w:tabs>
-          <w:tab w:val="num" w:pos="5760"/>
-        </w:tabs>
-        <w:ind w:left="5760" w:hanging="360"/>
-      </w:pPr>
-    </w:lvl>
-    <w:lvl w:ilvl="8" w:tentative="1">
-      <w:start w:val="1"/>
-      <w:numFmt w:val="decimal"/>
-      <w:lvlText w:val="%9."/>
-      <w:lvlJc w:val="left"/>
-      <w:pPr>
-        <w:tabs>
-          <w:tab w:val="num" w:pos="6480"/>
-        </w:tabs>
-        <w:ind w:left="6480" w:hanging="360"/>
-      </w:pPr>
-    </w:lvl>
-  </w:abstractNum>
-  <w:abstractNum w:abstractNumId="3" w15:restartNumberingAfterBreak="0">
-    <w:nsid w:val="53011F2C"/>
-    <w:multiLevelType w:val="multilevel"/>
-    <w:tmpl w:val="0ACA3412"/>
+    <w:tmpl w:val="0486C272"/>
     <w:lvl w:ilvl="0">
       <w:start w:val="1"/>
       <w:numFmt w:val="bullet"/>
@@ -11904,9 +11780,9 @@
     </w:lvl>
   </w:abstractNum>
   <w:abstractNum w:abstractNumId="4" w15:restartNumberingAfterBreak="0">
-    <w:nsid w:val="65F77D9C"/>
+    <w:nsid w:val="77D329AC"/>
     <w:multiLevelType w:val="multilevel"/>
-    <w:tmpl w:val="605C1672"/>
+    <w:tmpl w:val="AD4A60CA"/>
     <w:lvl w:ilvl="0">
       <w:start w:val="1"/>
       <w:numFmt w:val="bullet"/>
@@ -12052,20 +11928,20 @@
       </w:rPr>
     </w:lvl>
   </w:abstractNum>
-  <w:num w:numId="1" w16cid:durableId="1426994189">
+  <w:num w:numId="1" w16cid:durableId="155538533">
+    <w:abstractNumId w:val="3"/>
+  </w:num>
+  <w:num w:numId="2" w16cid:durableId="1181116831">
     <w:abstractNumId w:val="0"/>
   </w:num>
-  <w:num w:numId="2" w16cid:durableId="723916817">
-    <w:abstractNumId w:val="2"/>
-  </w:num>
-  <w:num w:numId="3" w16cid:durableId="207030109">
-    <w:abstractNumId w:val="3"/>
-  </w:num>
-  <w:num w:numId="4" w16cid:durableId="1268848540">
+  <w:num w:numId="3" w16cid:durableId="872234290">
     <w:abstractNumId w:val="1"/>
   </w:num>
-  <w:num w:numId="5" w16cid:durableId="826554254">
+  <w:num w:numId="4" w16cid:durableId="1272780706">
     <w:abstractNumId w:val="4"/>
+  </w:num>
+  <w:num w:numId="5" w16cid:durableId="318121498">
+    <w:abstractNumId w:val="2"/>
   </w:num>
 </w:numbering>
 </file>
@@ -12677,6 +12553,28 @@
       <w:spacing w:before="100" w:beforeAutospacing="1" w:after="100" w:afterAutospacing="1"/>
     </w:pPr>
   </w:style>
+  <w:style w:type="character" w:styleId="Hyperlink">
+    <w:name w:val="Hyperlink"/>
+    <w:basedOn w:val="DefaultParagraphFont"/>
+    <w:uiPriority w:val="99"/>
+    <w:semiHidden/>
+    <w:unhideWhenUsed/>
+    <w:rPr>
+      <w:color w:val="0000FF"/>
+      <w:u w:val="single"/>
+    </w:rPr>
+  </w:style>
+  <w:style w:type="character" w:styleId="FollowedHyperlink">
+    <w:name w:val="FollowedHyperlink"/>
+    <w:basedOn w:val="DefaultParagraphFont"/>
+    <w:uiPriority w:val="99"/>
+    <w:semiHidden/>
+    <w:unhideWhenUsed/>
+    <w:rPr>
+      <w:color w:val="800080"/>
+      <w:u w:val="single"/>
+    </w:rPr>
+  </w:style>
   <w:style w:type="character" w:customStyle="1" w:styleId="placeholder1">
     <w:name w:val="placeholder1"/>
     <w:basedOn w:val="DefaultParagraphFont"/>

</xml_diff>